<commit_message>
docs(formation): scenario de prise en main (demo + manuel de formation)
Parcours guide « du planteur au lot conforme » couvrant les nouveautes :
Aya, categorie obligatoire, reclassement en masse, pre-controle EUDR,
verrou recolte/achat, recherche cherchable, palmares des parcelles.
Sert de script de demo ET de scenario de formation (avec exercices).

- docs/SCENARIO_PRISE_EN_MAIN.md : source Markdown versionnable.
- docs/DEMO_SCRIPT.md : scenario ajoute au script de demo.
- Manuel_Formation_AgriVision_Pro.docx : nouveau chapitre (styles alignes).

Co-Authored-By: Claude Opus 4.8 <noreply@anthropic.com>
</commit_message>
<xml_diff>
--- a/docs/Manuel_Formation_AgriVision_Pro.docx
+++ b/docs/Manuel_Formation_AgriVision_Pro.docx
@@ -21183,6 +21183,393 @@
       <w:pPr>
         <w:spacing w:after="80"/>
       </w:pPr>
+    </w:p>
+    <w:p>
+      <w:r>
+        <w:br w:type="page"/>
+      </w:r>
+    </w:p>
+    <w:p>
+      <w:pPr>
+        <w:pStyle w:val="Heading1"/>
+      </w:pPr>
+      <w:r>
+        <w:t>Scénario de prise en main — « du planteur au lot conforme » (démo &amp; formation)</w:t>
+      </w:r>
+    </w:p>
+    <w:p>
+      <w:r>
+        <w:t>Ce parcours guidé sert à la fois de SCRIPT DE DÉMONSTRATION (~15 min) et de SCÉNARIO DE FORMATION pratique (~45 min avec exercices). On suit une histoire de bout en bout ; à chaque étape : ce qu'on fait, ce qu'on observe, le point clé.</w:t>
+      </w:r>
+    </w:p>
+    <w:p>
+      <w:r>
+        <w:t>Prérequis :</w:t>
+      </w:r>
+    </w:p>
+    <w:p>
+      <w:pPr>
+        <w:pStyle w:val="ListParagraph"/>
+      </w:pPr>
+      <w:r>
+        <w:t>Un compte administrateur ou gestionnaire de la coopérative.</w:t>
+      </w:r>
+    </w:p>
+    <w:p>
+      <w:pPr>
+        <w:pStyle w:val="ListParagraph"/>
+      </w:pPr>
+      <w:r>
+        <w:t>Après une mise à jour de la plateforme : recharger une fois avec Ctrl+Maj+R.</w:t>
+      </w:r>
+    </w:p>
+    <w:p>
+      <w:pPr>
+        <w:pStyle w:val="ListParagraph"/>
+      </w:pPr>
+      <w:r>
+        <w:t>Idéalement le registre de la coopérative importé (sinon, la coopérative de démonstration).</w:t>
+      </w:r>
+    </w:p>
+    <w:p>
+      <w:pPr>
+        <w:pStyle w:val="Heading2"/>
+      </w:pPr>
+      <w:r>
+        <w:t>Étape 0 — Se repérer et rencontrer Aya</w:t>
+      </w:r>
+    </w:p>
+    <w:p>
+      <w:pPr>
+        <w:pStyle w:val="ListParagraph"/>
+      </w:pPr>
+      <w:r>
+        <w:t>Se connecter : on arrive sur l'écran OPÉRATIONS (page d'accueil).</w:t>
+      </w:r>
+    </w:p>
+    <w:p>
+      <w:pPr>
+        <w:pStyle w:val="ListParagraph"/>
+      </w:pPr>
+      <w:r>
+        <w:t>Ouvrir « Aya · Assistant IA » (pilier Piloter). Aya est votre assistante : elle explique où trouver une fonction et répond sur vos chiffres.</w:t>
+      </w:r>
+    </w:p>
+    <w:p>
+      <w:pPr>
+        <w:pStyle w:val="ListParagraph"/>
+      </w:pPr>
+      <w:r>
+        <w:t>Exercice : demander à Aya « Où ajouter un producteur ? » puis « Combien de parcelles non conformes EUDR ? ».</w:t>
+      </w:r>
+    </w:p>
+    <w:p>
+      <w:pPr>
+        <w:pStyle w:val="ListParagraph"/>
+      </w:pPr>
+      <w:r>
+        <w:t>Point clé : Aya répond à partir de VOS données et n'invente aucun chiffre.</w:t>
+      </w:r>
+    </w:p>
+    <w:p>
+      <w:pPr>
+        <w:pStyle w:val="Heading2"/>
+      </w:pPr>
+      <w:r>
+        <w:t>Étape 1 — Enregistrer les producteurs avec la bonne catégorie (obligatoire)</w:t>
+      </w:r>
+    </w:p>
+    <w:p>
+      <w:r>
+        <w:t>Chaque planteur est soit MEMBRE (la coopérative organise sa récolte), soit NON-MEMBRE (on achète sa production bord champ). Cette catégorie est désormais OBLIGATOIRE : elle conditionne toute la chaîne (récolte ou achat, seuil OHADA de 20 % d'achats).</w:t>
+      </w:r>
+    </w:p>
+    <w:p>
+      <w:pPr>
+        <w:pStyle w:val="ListParagraph"/>
+      </w:pPr>
+      <w:r>
+        <w:t>Producteurs → « Nouveau producteur ».</w:t>
+      </w:r>
+    </w:p>
+    <w:p>
+      <w:pPr>
+        <w:pStyle w:val="ListParagraph"/>
+      </w:pPr>
+      <w:r>
+        <w:t>Renseigner le nom puis la CATÉGORIE (obligatoire) : Membre ou Non-membre. Sans catégorie, la création est refusée.</w:t>
+      </w:r>
+    </w:p>
+    <w:p>
+      <w:pPr>
+        <w:pStyle w:val="ListParagraph"/>
+      </w:pPr>
+      <w:r>
+        <w:t>Exercice : créer 1 membre et 1 non-membre.</w:t>
+      </w:r>
+    </w:p>
+    <w:p>
+      <w:pPr>
+        <w:pStyle w:val="ListParagraph"/>
+      </w:pPr>
+      <w:r>
+        <w:t>Point clé : fini le « tout le monde est membre » par défaut.</w:t>
+      </w:r>
+    </w:p>
+    <w:p>
+      <w:pPr>
+        <w:pStyle w:val="Heading2"/>
+      </w:pPr>
+      <w:r>
+        <w:t>Étape 2 — Reclasser en masse (coopérative à gros volume)</w:t>
+      </w:r>
+    </w:p>
+    <w:p>
+      <w:r>
+        <w:t>Après un import, des milliers de producteurs peuvent être tous « membre ». On corrige en une fois.</w:t>
+      </w:r>
+    </w:p>
+    <w:p>
+      <w:pPr>
+        <w:pStyle w:val="ListParagraph"/>
+      </w:pPr>
+      <w:r>
+        <w:t>Producteurs → (option) filtrer par recherche / localité → bouton « Classer en masse ».</w:t>
+      </w:r>
+    </w:p>
+    <w:p>
+      <w:pPr>
+        <w:pStyle w:val="ListParagraph"/>
+      </w:pPr>
+      <w:r>
+        <w:t>Choisir la catégorie cible (ex. Non-membre) : l'aperçu indique le nombre impacté. Laisser cochée l'option « ne toucher que l'autre catégorie » pour ne pas réécrire les déjà classés, puis Appliquer.</w:t>
+      </w:r>
+    </w:p>
+    <w:p>
+      <w:pPr>
+        <w:pStyle w:val="ListParagraph"/>
+      </w:pPr>
+      <w:r>
+        <w:t>Réservé aux rôles administrateur / gestionnaire.</w:t>
+      </w:r>
+    </w:p>
+    <w:p>
+      <w:pPr>
+        <w:pStyle w:val="ListParagraph"/>
+      </w:pPr>
+      <w:r>
+        <w:t>Exercice : filtrer une localité, tout passer en non-membre, vérifier le KPI « Part achats ».</w:t>
+      </w:r>
+    </w:p>
+    <w:p>
+      <w:pPr>
+        <w:pStyle w:val="Heading2"/>
+      </w:pPr>
+      <w:r>
+        <w:t>Étape 3 — Pré-contrôle EUDR AVANT d'intégrer une parcelle</w:t>
+      </w:r>
+    </w:p>
+    <w:p>
+      <w:r>
+        <w:t>Le critère décisif pour vendre en Europe : aucune déforestation après le 31/12/2020. On le vérifie AVANT d'acheter ou d'intégrer la parcelle.</w:t>
+      </w:r>
+    </w:p>
+    <w:p>
+      <w:pPr>
+        <w:pStyle w:val="ListParagraph"/>
+      </w:pPr>
+      <w:r>
+        <w:t>Opérations → bouton « Pré-contrôle EUDR ».</w:t>
+      </w:r>
+    </w:p>
+    <w:p>
+      <w:pPr>
+        <w:pStyle w:val="ListParagraph"/>
+      </w:pPr>
+      <w:r>
+        <w:t>Saisir latitude / longitude (ou GPS) → Vérifier. Verdict : Feu vert / Achat déconseillé / Indéterminé.</w:t>
+      </w:r>
+    </w:p>
+    <w:p>
+      <w:pPr>
+        <w:pStyle w:val="ListParagraph"/>
+      </w:pPr>
+      <w:r>
+        <w:t>Point clé : on ne perd pas de temps à intégrer une parcelle non vendable. « Indéterminé » = contrôle satellite réel non activé (mode simulation).</w:t>
+      </w:r>
+    </w:p>
+    <w:p>
+      <w:pPr>
+        <w:pStyle w:val="ListParagraph"/>
+      </w:pPr>
+      <w:r>
+        <w:t>Exercice : tester un point GPS.</w:t>
+      </w:r>
+    </w:p>
+    <w:p>
+      <w:pPr>
+        <w:pStyle w:val="Heading2"/>
+      </w:pPr>
+      <w:r>
+        <w:t>Étape 4 — Créer la plantation (catégorie du propriétaire)</w:t>
+      </w:r>
+    </w:p>
+    <w:p>
+      <w:pPr>
+        <w:pStyle w:val="ListParagraph"/>
+      </w:pPr>
+      <w:r>
+        <w:t>Opérations → « Nouvelle plantation ».</w:t>
+      </w:r>
+    </w:p>
+    <w:p>
+      <w:pPr>
+        <w:pStyle w:val="ListParagraph"/>
+      </w:pPr>
+      <w:r>
+        <w:t>Renseigner nom, propriétaire, CATÉGORIE DU PROPRIÉTAIRE (obligatoire, appliquée si le propriétaire est nouveau), position GPS et superficie.</w:t>
+      </w:r>
+    </w:p>
+    <w:p>
+      <w:pPr>
+        <w:pStyle w:val="ListParagraph"/>
+      </w:pPr>
+      <w:r>
+        <w:t>Astuce : délimiter la parcelle (Carte) améliore la précision satellite et EUDR.</w:t>
+      </w:r>
+    </w:p>
+    <w:p>
+      <w:pPr>
+        <w:pStyle w:val="Heading2"/>
+      </w:pPr>
+      <w:r>
+        <w:t>Étape 5 — Saisir la production : le verrou récolte / achat</w:t>
+      </w:r>
+    </w:p>
+    <w:p>
+      <w:r>
+        <w:t>Règle métier : MEMBRE = récolte uniquement ; NON-MEMBRE = achat uniquement. La plateforme bloque l'erreur.</w:t>
+      </w:r>
+    </w:p>
+    <w:p>
+      <w:pPr>
+        <w:pStyle w:val="ListParagraph"/>
+      </w:pPr>
+      <w:r>
+        <w:t>Membre → Récoltes : choisir la parcelle grâce au CHAMP DE RECHERCHE (taper quelques lettres) puis « Saisir une récolte ».</w:t>
+      </w:r>
+    </w:p>
+    <w:p>
+      <w:pPr>
+        <w:pStyle w:val="ListParagraph"/>
+      </w:pPr>
+      <w:r>
+        <w:t>Non-membre → Achats : le formulaire ne propose QUE les non-membres ; enregistrer l'achat (il génère une trace de volume traçable).</w:t>
+      </w:r>
+    </w:p>
+    <w:p>
+      <w:pPr>
+        <w:pStyle w:val="ListParagraph"/>
+      </w:pPr>
+      <w:r>
+        <w:t>Démonstration du verrou : tenter une récolte sur une parcelle de non-membre → message de blocage ; tenter un achat à un membre → blocage. C'est voulu (intégrité + OHADA).</w:t>
+      </w:r>
+    </w:p>
+    <w:p>
+      <w:pPr>
+        <w:pStyle w:val="ListParagraph"/>
+      </w:pPr>
+      <w:r>
+        <w:t>Nouveauté : partout où il y a des milliers de parcelles/producteurs, un champ de recherche filtre instantanément.</w:t>
+      </w:r>
+    </w:p>
+    <w:p>
+      <w:pPr>
+        <w:pStyle w:val="Heading2"/>
+      </w:pPr>
+      <w:r>
+        <w:t>Étape 6 — Piloter : le palmarès des parcelles</w:t>
+      </w:r>
+    </w:p>
+    <w:p>
+      <w:pPr>
+        <w:pStyle w:val="ListParagraph"/>
+      </w:pPr>
+      <w:r>
+        <w:t>Opérations → section « Palmarès des parcelles ».</w:t>
+      </w:r>
+    </w:p>
+    <w:p>
+      <w:pPr>
+        <w:pStyle w:val="ListParagraph"/>
+      </w:pPr>
+      <w:r>
+        <w:t>Onglet « À redresser » : les 50 parcelles au risque le plus élevé → cibler l'appui technique.</w:t>
+      </w:r>
+    </w:p>
+    <w:p>
+      <w:pPr>
+        <w:pStyle w:val="ListParagraph"/>
+      </w:pPr>
+      <w:r>
+        <w:t>Onglet « Modèles » : les 50 meilleures → visites d'échange, champs-écoles, diffusion des bonnes pratiques (« faire école »).</w:t>
+      </w:r>
+    </w:p>
+    <w:p>
+      <w:pPr>
+        <w:pStyle w:val="ListParagraph"/>
+      </w:pPr>
+      <w:r>
+        <w:t>Point clé : on priorise l'action et on s'appuie sur les meilleurs comme modèles.</w:t>
+      </w:r>
+    </w:p>
+    <w:p>
+      <w:pPr>
+        <w:pStyle w:val="Heading2"/>
+      </w:pPr>
+      <w:r>
+        <w:t>Récapitulatif express (à retenir)</w:t>
+      </w:r>
+    </w:p>
+    <w:p>
+      <w:pPr>
+        <w:pStyle w:val="ListParagraph"/>
+      </w:pPr>
+      <w:r>
+        <w:t>Catégorie OBLIGATOIRE à la création ; reclassement en masse pour rattraper l'historique.</w:t>
+      </w:r>
+    </w:p>
+    <w:p>
+      <w:pPr>
+        <w:pStyle w:val="ListParagraph"/>
+      </w:pPr>
+      <w:r>
+        <w:t>Membre = récolte, non-membre = achat (verrou automatique).</w:t>
+      </w:r>
+    </w:p>
+    <w:p>
+      <w:pPr>
+        <w:pStyle w:val="ListParagraph"/>
+      </w:pPr>
+      <w:r>
+        <w:t>Pré-contrôle EUDR AVANT d'intégrer une parcelle.</w:t>
+      </w:r>
+    </w:p>
+    <w:p>
+      <w:pPr>
+        <w:pStyle w:val="ListParagraph"/>
+      </w:pPr>
+      <w:r>
+        <w:t>Recherche cherchable partout (parcelles, producteurs).</w:t>
+      </w:r>
+    </w:p>
+    <w:p>
+      <w:pPr>
+        <w:pStyle w:val="ListParagraph"/>
+      </w:pPr>
+      <w:r>
+        <w:t>Palmarès pour prioriser ; Aya pour être guidé.</w:t>
+      </w:r>
     </w:p>
     <w:sectPr>
       <w:footerReference w:type="default" r:id="rId7"/>

</xml_diff>